<commit_message>
docs(audit): add BM006 visual PDF review artifact
Add BM-006 visual/PDF review evidence artifacts, track the BM-006 runtime UX demo profile used by the offline regeneration script, and record the accepted v3 top-right visual calibration for BM-006.

The visual approval is scoped to BM-006 Phase A only. This does not claim global FIDELITY_COMPLETE_EVIDENCED, does not promote BM-006 to the runtimeReady allowlist, and does not touch Batch 6.
</commit_message>
<xml_diff>
--- a/storage/templates/normalized-docx/BM-006/BM-006_normalized.docx
+++ b/storage/templates/normalized-docx/BM-006/BM-006_normalized.docx
@@ -15,12 +15,12 @@
               <wp:anchor distT="0" distB="0" distL="114300" distR="114300" simplePos="0" relativeHeight="251659264" behindDoc="0" locked="0" layoutInCell="1" allowOverlap="1">
                 <wp:simplePos x="0" y="0"/>
                 <wp:positionH relativeFrom="column">
-                  <wp:posOffset>3668395</wp:posOffset>
+                  <wp:posOffset>3700000</wp:posOffset>
                 </wp:positionH>
                 <wp:positionV relativeFrom="paragraph">
-                  <wp:posOffset>109220</wp:posOffset>
+                  <wp:posOffset>85000</wp:posOffset>
                 </wp:positionV>
-                <wp:extent cx="2404110" cy="541655"/>
+                <wp:extent cx="2600000" cy="700000"/>
                 <wp:effectExtent l="4445" t="5080" r="17145" b="12065"/>
                 <wp:wrapSquare wrapText="bothSides"/>
                 <wp:docPr id="539" name="Text Box 98"/>
@@ -34,7 +34,7 @@
                       <wps:spPr bwMode="auto">
                         <a:xfrm>
                           <a:off x="0" y="0"/>
-                          <a:ext cx="1475105" cy="450850"/>
+                          <a:ext cx="2200000" cy="600000"/>
                         </a:xfrm>
                         <a:prstGeom prst="rect">
                           <a:avLst/>

</xml_diff>